<commit_message>
build(discover-aging): regenerate tables and figures docx to latest
- 02_tables_main.docx: Tables 1-4 (diagnosis gap, care cascade, Erreygers
  concentration indices, incremental value) matching manuscript.
- 03_figures.docx: 6 main + 2 supplementary figures (8 images embedded),
  including India maps, care cascade and concentration-index forest.
- 04_supplementary_material.docx: refreshed (S1-S13 + Note S10).

Co-Authored-By: Claude Fable 5 <noreply@anthropic.com>
</commit_message>
<xml_diff>
--- a/india-ageing-atlas/biological_age_gap_2026/submission_assets/docx/02_tables_main.docx
+++ b/india-ageing-atlas/biological_age_gap_2026/submission_assets/docx/02_tables_main.docx
@@ -11,13 +11,13 @@
         <w:t xml:space="preserve">Tables (main text)</w:t>
       </w:r>
     </w:p>
-    <w:bookmarkStart w:id="9" w:name="Xda021f9c637f44def2c5ea6faf5910067ed8918"/>
+    <w:bookmarkStart w:id="9" w:name="X642fd02c99d64db18fdc02b5b9780557310450b"/>
     <w:p>
       <w:pPr>
         <w:pStyle w:val="Heading2"/>
       </w:pPr>
       <w:r>
-        <w:t xml:space="preserve">Table 1. The diagnosis gap: biologically measured vs self-reported disease (weighted %, 95% CI)</w:t>
+        <w:t xml:space="preserve">Table 1. The diagnosis gap: biologically measured vs self-reported disease (weighted %, 95% cluster-bootstrap CI)</w:t>
       </w:r>
     </w:p>
     <w:tbl>
@@ -455,13 +455,13 @@
       </w:tr>
     </w:tbl>
     <w:bookmarkEnd w:id="9"/>
-    <w:bookmarkStart w:id="10" w:name="Xe3da81985ee5ee94a0e630f8a8b9837a928e1d6"/>
+    <w:bookmarkStart w:id="10" w:name="X0828bae0fc6606f6d5c54eadf95708bf1e2d223"/>
     <w:p>
       <w:pPr>
         <w:pStyle w:val="Heading2"/>
       </w:pPr>
       <w:r>
-        <w:t xml:space="preserve">Table 2. Care cascade among all affected (% of affected, weighted, 95% CI)</w:t>
+        <w:t xml:space="preserve">Table 2. Care cascade among all affected (aware -&gt; treated -&gt; controlled; % of affected, weighted, 95% CI)</w:t>
       </w:r>
     </w:p>
     <w:tbl>
@@ -831,13 +831,13 @@
       </w:tr>
     </w:tbl>
     <w:bookmarkEnd w:id="10"/>
-    <w:bookmarkStart w:id="11" w:name="Xb975043aae2a64ae757dac439d6b366ddfa9e1f"/>
+    <w:bookmarkStart w:id="11" w:name="Xcb489d01d324287629a76fa83b413e0012b7448"/>
     <w:p>
       <w:pPr>
         <w:pStyle w:val="Heading2"/>
       </w:pPr>
       <w:r>
-        <w:t xml:space="preserve">Table 3. Socioeconomic inequality: Erreygers concentration indices (wealth-ranked)</w:t>
+        <w:t xml:space="preserve">Table 3. Socioeconomic inequality: Erreygers concentration indices (wealth-ranked; negative = pro-poor)</w:t>
       </w:r>
     </w:p>
     <w:tbl>
@@ -1308,13 +1308,13 @@
       </w:tr>
     </w:tbl>
     <w:bookmarkEnd w:id="11"/>
-    <w:bookmarkStart w:id="12" w:name="X9afa79b936686ee49cc314dfad9bab236721de3"/>
+    <w:bookmarkStart w:id="12" w:name="X19cb4a7fea09b947c0b8a1db618fdeaab7ccd35"/>
     <w:p>
       <w:pPr>
         <w:pStyle w:val="Heading2"/>
       </w:pPr>
       <w:r>
-        <w:t xml:space="preserve">Table 4. Incremental value for predicting past-year hospitalisation (nested models)</w:t>
+        <w:t xml:space="preserve">Table 4. Incremental value for predicting past-year hospitalisation (nested weighted logistic models)</w:t>
       </w:r>
     </w:p>
     <w:tbl>

</xml_diff>